<commit_message>
Refresh submission calibration readiness
</commit_message>
<xml_diff>
--- a/paper/submission/cover-letter.docx
+++ b/paper/submission/cover-letter.docx
@@ -290,7 +290,7 @@
           <w:sz w:val="24"/>
           <w:szCs w:val="24"/>
         </w:rPr>
-        <w:t xml:space="preserve">The IMM Calculator aligns to the NASA Integrated Medical Model of Keenan et al. (2015) and reproduces the K15 §II.A.9 sum-of-products per-event quality-time-lost formula across the canonical 100-condition K15 catalogue at T = 100,000 trials. All 100 per-condition priors are evidence-based (34 tier-A NASA-attributed, 66 tier-B PyMC NUTS-fitted from terrestrial, Antarctic, submarine, and military population epidemiological data across iterative calibration passes); zero synthetic placeholders remain. A two-panel condition-set sensitivity analysis demonstrates that the K15 reproduction is non-circular: the 34 NASA-sourced conditions alone produce issHMS CHI within K15's published CI₉₅, and the 66 independently-fitted tier-B conditions add evidence-based risk that is not back-calibrated against K15 aggregates.</w:t>
+        <w:t xml:space="preserve">The IMM Calculator aligns to the NASA Integrated Medical Model of Keenan et al. (2015) and reproduces the K15 §II.A.9 sum-of-products per-event quality-time-lost formula across the 100-condition K15 catalogue at T = 100,000 trials, with one disclosed source-cited analog behavioral extension (interpersonal-conflict) in the released app. All 101 current per-condition priors are evidence-based (34 tier-A NASA-attributed, 66 tier-B PyMC NUTS-fitted from terrestrial, Antarctic, submarine, and military population epidemiological data across iterative calibration passes, and one tier-B literature extension); zero synthetic placeholders remain. A two-panel condition-set sensitivity analysis demonstrates that the K15 reproduction is non-circular: the 34 NASA-sourced conditions alone produce issHMS CHI within K15's published CI₉₅, and the tier-B conditions add evidence-based risk that is not back-calibrated against K15 aggregates.</w:t>
       </w:r>
     </w:p>
     <w:p>
@@ -321,25 +321,23 @@
           <w:sz w:val="24"/>
           <w:szCs w:val="24"/>
         </w:rPr>
-        <w:t xml:space="preserve">The software artifact is MIT-licensed and Zenodo-archived (DOI </w:t>
-      </w:r>
-      <w:r>
-        <w:rPr>
-          <w:rFonts w:ascii="Times New Roman" w:cs="Times New Roman" w:eastAsia="Times New Roman" w:hAnsi="Times New Roman"/>
-          <w:i/>
-          <w:iCs/>
-          <w:sz w:val="24"/>
-          <w:szCs w:val="24"/>
-        </w:rPr>
-        <w:t xml:space="preserve">assigned upon archival</w:t>
-      </w:r>
-      <w:r>
-        <w:rPr>
-          <w:rFonts w:ascii="Times New Roman" w:cs="Times New Roman" w:eastAsia="Times New Roman" w:hAnsi="Times New Roman"/>
-          <w:sz w:val="24"/>
-          <w:szCs w:val="24"/>
-        </w:rPr>
-        <w:t xml:space="preserve">) at the commit used to generate every figure. The repository at </w:t>
+        <w:t xml:space="preserve">The software artifact is MIT-licensed and will be archived at Zenodo before portal upload; the DOI will be inserted into the manuscript at that final archive step. The current figure-generation commit marker is </w:t>
+      </w:r>
+      <w:r>
+        <w:rPr>
+          <w:rFonts w:ascii="Times New Roman" w:cs="Times New Roman" w:eastAsia="Times New Roman" w:hAnsi="Times New Roman"/>
+          <w:sz w:val="24"/>
+          <w:szCs w:val="24"/>
+        </w:rPr>
+        <w:t xml:space="preserve">538e16ccff94</w:t>
+      </w:r>
+      <w:r>
+        <w:rPr>
+          <w:rFonts w:ascii="Times New Roman" w:cs="Times New Roman" w:eastAsia="Times New Roman" w:hAnsi="Times New Roman"/>
+          <w:sz w:val="24"/>
+          <w:szCs w:val="24"/>
+        </w:rPr>
+        <w:t xml:space="preserve">, and the repository at </w:t>
       </w:r>
       <w:r>
         <w:rPr>
@@ -355,7 +353,7 @@
           <w:sz w:val="24"/>
           <w:szCs w:val="24"/>
         </w:rPr>
-        <w:t xml:space="preserve"> contains the full source, the test suite (355+ vitest + 20 Playwright tests), the V&amp;V dossier, and reproducibility instructions.</w:t>
+        <w:t xml:space="preserve"> contains the full source, the test suite, the V&amp;V dossier, and reproducibility instructions.</w:t>
       </w:r>
     </w:p>
     <w:p>

</xml_diff>